<commit_message>
vault backup: 2026-09-02 20:09:53
</commit_message>
<xml_diff>
--- a/1-SOURCES/Commentaries/ཤེར་སྙིང་རྣམ་བཤད་ཡུམ་དོན་རབ་གསལ།.docx
+++ b/1-SOURCES/Commentaries/ཤེར་སྙིང་རྣམ་བཤད་ཡུམ་དོན་རབ་གསལ།.docx
@@ -392,7 +392,6 @@
         </w:rPr>
         <w:t xml:space="preserve"> </w:t>
       </w:r>
-      <w:proofErr w:type="spellStart"/>
       <w:r>
         <w:rPr>
           <w:rFonts w:ascii="Microsoft Himalaya" w:eastAsia="Times New Roman" w:hAnsi="Microsoft Himalaya" w:cs="Microsoft Himalaya"/>
@@ -405,7 +404,6 @@
         </w:rPr>
         <w:t>།</w:t>
       </w:r>
-      <w:proofErr w:type="spellEnd"/>
     </w:p>
     <w:p>
       <w:pPr>
@@ -466,7 +464,6 @@
         </w:rPr>
         <w:t xml:space="preserve"> </w:t>
       </w:r>
-      <w:proofErr w:type="spellStart"/>
       <w:r>
         <w:rPr>
           <w:rFonts w:ascii="Microsoft Himalaya" w:eastAsia="Times New Roman" w:hAnsi="Microsoft Himalaya" w:cs="Microsoft Himalaya"/>
@@ -479,7 +476,6 @@
         </w:rPr>
         <w:t>།</w:t>
       </w:r>
-      <w:proofErr w:type="spellEnd"/>
     </w:p>
     <w:p>
       <w:pPr>
@@ -540,7 +536,6 @@
         </w:rPr>
         <w:t xml:space="preserve"> </w:t>
       </w:r>
-      <w:proofErr w:type="spellStart"/>
       <w:r>
         <w:rPr>
           <w:rFonts w:ascii="Microsoft Himalaya" w:eastAsia="Times New Roman" w:hAnsi="Microsoft Himalaya" w:cs="Microsoft Himalaya"/>
@@ -553,7 +548,6 @@
         </w:rPr>
         <w:t>།</w:t>
       </w:r>
-      <w:proofErr w:type="spellEnd"/>
     </w:p>
     <w:p>
       <w:pPr>
@@ -614,7 +608,6 @@
         </w:rPr>
         <w:t xml:space="preserve"> </w:t>
       </w:r>
-      <w:proofErr w:type="spellStart"/>
       <w:r>
         <w:rPr>
           <w:rFonts w:ascii="Microsoft Himalaya" w:eastAsia="Times New Roman" w:hAnsi="Microsoft Himalaya" w:cs="Microsoft Himalaya"/>
@@ -627,7 +620,6 @@
         </w:rPr>
         <w:t>།</w:t>
       </w:r>
-      <w:proofErr w:type="spellEnd"/>
     </w:p>
     <w:p>
       <w:pPr>
@@ -738,32 +730,22 @@
           <w:szCs w:val="24"/>
         </w:rPr>
       </w:pPr>
-      <w:proofErr w:type="gramStart"/>
-      <w:r>
-        <w:rPr>
-          <w:rFonts w:ascii="Arial" w:eastAsia="Times New Roman" w:hAnsi="Arial" w:cs="Arial"/>
-          <w:sz w:val="32"/>
-          <w:szCs w:val="32"/>
-        </w:rPr>
-        <w:t>, ​</w:t>
-      </w:r>
-      <w:proofErr w:type="spellStart"/>
-      <w:r>
-        <w:rPr>
-          <w:rFonts w:ascii="Microsoft Himalaya" w:eastAsia="Times New Roman" w:hAnsi="Microsoft Himalaya" w:cs="Microsoft Himalaya"/>
-          <w:sz w:val="32"/>
-          <w:szCs w:val="32"/>
-        </w:rPr>
-        <w:t>དང</w:t>
-      </w:r>
-      <w:proofErr w:type="gramEnd"/>
-      <w:r>
-        <w:rPr>
-          <w:rFonts w:ascii="Microsoft Himalaya" w:eastAsia="Times New Roman" w:hAnsi="Microsoft Himalaya" w:cs="Microsoft Himalaya"/>
-          <w:sz w:val="32"/>
-          <w:szCs w:val="32"/>
-        </w:rPr>
-        <w:t>་པོ</w:t>
+      <w:r>
+        <w:rPr>
+          <w:rFonts w:ascii="Arial" w:eastAsia="Times New Roman" w:hAnsi="Arial" w:cs="Arial"/>
+          <w:sz w:val="32"/>
+          <w:szCs w:val="32"/>
+        </w:rPr>
+        <w:t xml:space="preserve"> ​</w:t>
+      </w:r>
+      <w:proofErr w:type="spellStart"/>
+      <w:r>
+        <w:rPr>
+          <w:rFonts w:ascii="Microsoft Himalaya" w:eastAsia="Times New Roman" w:hAnsi="Microsoft Himalaya" w:cs="Microsoft Himalaya"/>
+          <w:sz w:val="32"/>
+          <w:szCs w:val="32"/>
+        </w:rPr>
+        <w:t>དང་པོ</w:t>
       </w:r>
       <w:proofErr w:type="spellEnd"/>
       <w:r>
@@ -1194,16 +1176,14 @@
         </w:rPr>
         <w:t xml:space="preserve"> </w:t>
       </w:r>
-      <w:proofErr w:type="spellStart"/>
-      <w:r>
-        <w:rPr>
-          <w:rFonts w:ascii="Microsoft Himalaya" w:eastAsia="Times New Roman" w:hAnsi="Microsoft Himalaya" w:cs="Microsoft Himalaya"/>
-          <w:sz w:val="32"/>
-          <w:szCs w:val="32"/>
-        </w:rPr>
-        <w:t>།</w:t>
-      </w:r>
-      <w:proofErr w:type="spellEnd"/>
+      <w:r>
+        <w:rPr>
+          <w:rFonts w:ascii="Microsoft Himalaya" w:eastAsia="Times New Roman" w:hAnsi="Microsoft Himalaya" w:cs="Microsoft Himalaya"/>
+          <w:sz w:val="32"/>
+          <w:szCs w:val="32"/>
+        </w:rPr>
+        <w:t>།</w:t>
+      </w:r>
     </w:p>
     <w:p>
       <w:pPr>
@@ -1590,16 +1570,14 @@
         </w:rPr>
         <w:t xml:space="preserve"> </w:t>
       </w:r>
-      <w:proofErr w:type="spellStart"/>
-      <w:r>
-        <w:rPr>
-          <w:rFonts w:ascii="Microsoft Himalaya" w:eastAsia="Times New Roman" w:hAnsi="Microsoft Himalaya" w:cs="Microsoft Himalaya"/>
-          <w:sz w:val="32"/>
-          <w:szCs w:val="32"/>
-        </w:rPr>
-        <w:t>།</w:t>
-      </w:r>
-      <w:proofErr w:type="spellEnd"/>
+      <w:r>
+        <w:rPr>
+          <w:rFonts w:ascii="Microsoft Himalaya" w:eastAsia="Times New Roman" w:hAnsi="Microsoft Himalaya" w:cs="Microsoft Himalaya"/>
+          <w:sz w:val="32"/>
+          <w:szCs w:val="32"/>
+        </w:rPr>
+        <w:t>།</w:t>
+      </w:r>
     </w:p>
     <w:p>
       <w:pPr>
@@ -1716,16 +1694,14 @@
         </w:rPr>
         <w:t xml:space="preserve"> </w:t>
       </w:r>
-      <w:proofErr w:type="spellStart"/>
-      <w:r>
-        <w:rPr>
-          <w:rFonts w:ascii="Microsoft Himalaya" w:eastAsia="Times New Roman" w:hAnsi="Microsoft Himalaya" w:cs="Microsoft Himalaya"/>
-          <w:sz w:val="32"/>
-          <w:szCs w:val="32"/>
-        </w:rPr>
-        <w:t>།</w:t>
-      </w:r>
-      <w:proofErr w:type="spellEnd"/>
+      <w:r>
+        <w:rPr>
+          <w:rFonts w:ascii="Microsoft Himalaya" w:eastAsia="Times New Roman" w:hAnsi="Microsoft Himalaya" w:cs="Microsoft Himalaya"/>
+          <w:sz w:val="32"/>
+          <w:szCs w:val="32"/>
+        </w:rPr>
+        <w:t>།</w:t>
+      </w:r>
     </w:p>
     <w:p>
       <w:pPr>
@@ -1770,16 +1746,14 @@
         </w:rPr>
         <w:t xml:space="preserve"> </w:t>
       </w:r>
-      <w:proofErr w:type="spellStart"/>
-      <w:r>
-        <w:rPr>
-          <w:rFonts w:ascii="Microsoft Himalaya" w:eastAsia="Times New Roman" w:hAnsi="Microsoft Himalaya" w:cs="Microsoft Himalaya"/>
-          <w:sz w:val="32"/>
-          <w:szCs w:val="32"/>
-        </w:rPr>
-        <w:t>།</w:t>
-      </w:r>
-      <w:proofErr w:type="spellEnd"/>
+      <w:r>
+        <w:rPr>
+          <w:rFonts w:ascii="Microsoft Himalaya" w:eastAsia="Times New Roman" w:hAnsi="Microsoft Himalaya" w:cs="Microsoft Himalaya"/>
+          <w:sz w:val="32"/>
+          <w:szCs w:val="32"/>
+        </w:rPr>
+        <w:t>།</w:t>
+      </w:r>
     </w:p>
     <w:p>
       <w:pPr>
@@ -1824,16 +1798,14 @@
         </w:rPr>
         <w:t xml:space="preserve"> </w:t>
       </w:r>
-      <w:proofErr w:type="spellStart"/>
-      <w:r>
-        <w:rPr>
-          <w:rFonts w:ascii="Microsoft Himalaya" w:eastAsia="Times New Roman" w:hAnsi="Microsoft Himalaya" w:cs="Microsoft Himalaya"/>
-          <w:sz w:val="32"/>
-          <w:szCs w:val="32"/>
-        </w:rPr>
-        <w:t>།</w:t>
-      </w:r>
-      <w:proofErr w:type="spellEnd"/>
+      <w:r>
+        <w:rPr>
+          <w:rFonts w:ascii="Microsoft Himalaya" w:eastAsia="Times New Roman" w:hAnsi="Microsoft Himalaya" w:cs="Microsoft Himalaya"/>
+          <w:sz w:val="32"/>
+          <w:szCs w:val="32"/>
+        </w:rPr>
+        <w:t>།</w:t>
+      </w:r>
     </w:p>
     <w:p>
       <w:pPr>
@@ -2703,16 +2675,14 @@
         </w:rPr>
         <w:t xml:space="preserve"> </w:t>
       </w:r>
-      <w:proofErr w:type="spellStart"/>
-      <w:r>
-        <w:rPr>
-          <w:rFonts w:ascii="Microsoft Himalaya" w:eastAsia="Times New Roman" w:hAnsi="Microsoft Himalaya" w:cs="Microsoft Himalaya"/>
-          <w:sz w:val="32"/>
-          <w:szCs w:val="32"/>
-        </w:rPr>
-        <w:t>།</w:t>
-      </w:r>
-      <w:proofErr w:type="spellEnd"/>
+      <w:r>
+        <w:rPr>
+          <w:rFonts w:ascii="Microsoft Himalaya" w:eastAsia="Times New Roman" w:hAnsi="Microsoft Himalaya" w:cs="Microsoft Himalaya"/>
+          <w:sz w:val="32"/>
+          <w:szCs w:val="32"/>
+        </w:rPr>
+        <w:t>།</w:t>
+      </w:r>
     </w:p>
     <w:p>
       <w:pPr>
@@ -3013,16 +2983,14 @@
         </w:rPr>
         <w:t xml:space="preserve"> </w:t>
       </w:r>
-      <w:proofErr w:type="spellStart"/>
-      <w:r>
-        <w:rPr>
-          <w:rFonts w:ascii="Microsoft Himalaya" w:eastAsia="Times New Roman" w:hAnsi="Microsoft Himalaya" w:cs="Microsoft Himalaya"/>
-          <w:sz w:val="32"/>
-          <w:szCs w:val="32"/>
-        </w:rPr>
-        <w:t>།</w:t>
-      </w:r>
-      <w:proofErr w:type="spellEnd"/>
+      <w:r>
+        <w:rPr>
+          <w:rFonts w:ascii="Microsoft Himalaya" w:eastAsia="Times New Roman" w:hAnsi="Microsoft Himalaya" w:cs="Microsoft Himalaya"/>
+          <w:sz w:val="32"/>
+          <w:szCs w:val="32"/>
+        </w:rPr>
+        <w:t>།</w:t>
+      </w:r>
     </w:p>
     <w:p>
       <w:pPr>
@@ -3095,16 +3063,14 @@
         </w:rPr>
         <w:t xml:space="preserve"> </w:t>
       </w:r>
-      <w:proofErr w:type="spellStart"/>
-      <w:r>
-        <w:rPr>
-          <w:rFonts w:ascii="Microsoft Himalaya" w:eastAsia="Times New Roman" w:hAnsi="Microsoft Himalaya" w:cs="Microsoft Himalaya"/>
-          <w:sz w:val="32"/>
-          <w:szCs w:val="32"/>
-        </w:rPr>
-        <w:t>།</w:t>
-      </w:r>
-      <w:proofErr w:type="spellEnd"/>
+      <w:r>
+        <w:rPr>
+          <w:rFonts w:ascii="Microsoft Himalaya" w:eastAsia="Times New Roman" w:hAnsi="Microsoft Himalaya" w:cs="Microsoft Himalaya"/>
+          <w:sz w:val="32"/>
+          <w:szCs w:val="32"/>
+        </w:rPr>
+        <w:t>།</w:t>
+      </w:r>
     </w:p>
     <w:p>
       <w:pPr>
@@ -4144,16 +4110,14 @@
         </w:rPr>
         <w:t xml:space="preserve"> </w:t>
       </w:r>
-      <w:proofErr w:type="spellStart"/>
-      <w:r>
-        <w:rPr>
-          <w:rFonts w:ascii="Microsoft Himalaya" w:eastAsia="Times New Roman" w:hAnsi="Microsoft Himalaya" w:cs="Microsoft Himalaya"/>
-          <w:sz w:val="32"/>
-          <w:szCs w:val="32"/>
-        </w:rPr>
-        <w:t>།</w:t>
-      </w:r>
-      <w:proofErr w:type="spellEnd"/>
+      <w:r>
+        <w:rPr>
+          <w:rFonts w:ascii="Microsoft Himalaya" w:eastAsia="Times New Roman" w:hAnsi="Microsoft Himalaya" w:cs="Microsoft Himalaya"/>
+          <w:sz w:val="32"/>
+          <w:szCs w:val="32"/>
+        </w:rPr>
+        <w:t>།</w:t>
+      </w:r>
     </w:p>
     <w:p>
       <w:pPr>
@@ -4354,16 +4318,14 @@
         </w:rPr>
         <w:t xml:space="preserve"> </w:t>
       </w:r>
-      <w:proofErr w:type="spellStart"/>
-      <w:r>
-        <w:rPr>
-          <w:rFonts w:ascii="Microsoft Himalaya" w:eastAsia="Times New Roman" w:hAnsi="Microsoft Himalaya" w:cs="Microsoft Himalaya"/>
-          <w:sz w:val="32"/>
-          <w:szCs w:val="32"/>
-        </w:rPr>
-        <w:t>།</w:t>
-      </w:r>
-      <w:proofErr w:type="spellEnd"/>
+      <w:r>
+        <w:rPr>
+          <w:rFonts w:ascii="Microsoft Himalaya" w:eastAsia="Times New Roman" w:hAnsi="Microsoft Himalaya" w:cs="Microsoft Himalaya"/>
+          <w:sz w:val="32"/>
+          <w:szCs w:val="32"/>
+        </w:rPr>
+        <w:t>།</w:t>
+      </w:r>
     </w:p>
     <w:p>
       <w:pPr>
@@ -4706,16 +4668,14 @@
         </w:rPr>
         <w:t xml:space="preserve"> </w:t>
       </w:r>
-      <w:proofErr w:type="spellStart"/>
-      <w:r>
-        <w:rPr>
-          <w:rFonts w:ascii="Microsoft Himalaya" w:eastAsia="Times New Roman" w:hAnsi="Microsoft Himalaya" w:cs="Microsoft Himalaya"/>
-          <w:sz w:val="32"/>
-          <w:szCs w:val="32"/>
-        </w:rPr>
-        <w:t>།</w:t>
-      </w:r>
-      <w:proofErr w:type="spellEnd"/>
+      <w:r>
+        <w:rPr>
+          <w:rFonts w:ascii="Microsoft Himalaya" w:eastAsia="Times New Roman" w:hAnsi="Microsoft Himalaya" w:cs="Microsoft Himalaya"/>
+          <w:sz w:val="32"/>
+          <w:szCs w:val="32"/>
+        </w:rPr>
+        <w:t>།</w:t>
+      </w:r>
     </w:p>
     <w:p>
       <w:pPr>
@@ -4752,16 +4712,14 @@
         </w:rPr>
         <w:t xml:space="preserve"> </w:t>
       </w:r>
-      <w:proofErr w:type="spellStart"/>
-      <w:r>
-        <w:rPr>
-          <w:rFonts w:ascii="Microsoft Himalaya" w:eastAsia="Times New Roman" w:hAnsi="Microsoft Himalaya" w:cs="Microsoft Himalaya"/>
-          <w:sz w:val="32"/>
-          <w:szCs w:val="32"/>
-        </w:rPr>
-        <w:t>།</w:t>
-      </w:r>
-      <w:proofErr w:type="spellEnd"/>
+      <w:r>
+        <w:rPr>
+          <w:rFonts w:ascii="Microsoft Himalaya" w:eastAsia="Times New Roman" w:hAnsi="Microsoft Himalaya" w:cs="Microsoft Himalaya"/>
+          <w:sz w:val="32"/>
+          <w:szCs w:val="32"/>
+        </w:rPr>
+        <w:t>།</w:t>
+      </w:r>
     </w:p>
     <w:p>
       <w:pPr>
@@ -4806,16 +4764,14 @@
         </w:rPr>
         <w:t xml:space="preserve"> </w:t>
       </w:r>
-      <w:proofErr w:type="spellStart"/>
-      <w:r>
-        <w:rPr>
-          <w:rFonts w:ascii="Microsoft Himalaya" w:eastAsia="Times New Roman" w:hAnsi="Microsoft Himalaya" w:cs="Microsoft Himalaya"/>
-          <w:sz w:val="32"/>
-          <w:szCs w:val="32"/>
-        </w:rPr>
-        <w:t>།</w:t>
-      </w:r>
-      <w:proofErr w:type="spellEnd"/>
+      <w:r>
+        <w:rPr>
+          <w:rFonts w:ascii="Microsoft Himalaya" w:eastAsia="Times New Roman" w:hAnsi="Microsoft Himalaya" w:cs="Microsoft Himalaya"/>
+          <w:sz w:val="32"/>
+          <w:szCs w:val="32"/>
+        </w:rPr>
+        <w:t>།</w:t>
+      </w:r>
     </w:p>
     <w:p>
       <w:pPr>
@@ -4860,16 +4816,14 @@
         </w:rPr>
         <w:t xml:space="preserve"> </w:t>
       </w:r>
-      <w:proofErr w:type="spellStart"/>
-      <w:r>
-        <w:rPr>
-          <w:rFonts w:ascii="Microsoft Himalaya" w:eastAsia="Times New Roman" w:hAnsi="Microsoft Himalaya" w:cs="Microsoft Himalaya"/>
-          <w:sz w:val="32"/>
-          <w:szCs w:val="32"/>
-        </w:rPr>
-        <w:t>།</w:t>
-      </w:r>
-      <w:proofErr w:type="spellEnd"/>
+      <w:r>
+        <w:rPr>
+          <w:rFonts w:ascii="Microsoft Himalaya" w:eastAsia="Times New Roman" w:hAnsi="Microsoft Himalaya" w:cs="Microsoft Himalaya"/>
+          <w:sz w:val="32"/>
+          <w:szCs w:val="32"/>
+        </w:rPr>
+        <w:t>།</w:t>
+      </w:r>
     </w:p>
     <w:p>
       <w:pPr>
@@ -4914,16 +4868,14 @@
         </w:rPr>
         <w:t xml:space="preserve"> </w:t>
       </w:r>
-      <w:proofErr w:type="spellStart"/>
-      <w:r>
-        <w:rPr>
-          <w:rFonts w:ascii="Microsoft Himalaya" w:eastAsia="Times New Roman" w:hAnsi="Microsoft Himalaya" w:cs="Microsoft Himalaya"/>
-          <w:sz w:val="32"/>
-          <w:szCs w:val="32"/>
-        </w:rPr>
-        <w:t>།</w:t>
-      </w:r>
-      <w:proofErr w:type="spellEnd"/>
+      <w:r>
+        <w:rPr>
+          <w:rFonts w:ascii="Microsoft Himalaya" w:eastAsia="Times New Roman" w:hAnsi="Microsoft Himalaya" w:cs="Microsoft Himalaya"/>
+          <w:sz w:val="32"/>
+          <w:szCs w:val="32"/>
+        </w:rPr>
+        <w:t>།</w:t>
+      </w:r>
     </w:p>
     <w:p>
       <w:pPr>
@@ -4995,16 +4947,14 @@
         </w:rPr>
         <w:t xml:space="preserve"> </w:t>
       </w:r>
-      <w:proofErr w:type="spellStart"/>
-      <w:r>
-        <w:rPr>
-          <w:rFonts w:ascii="Microsoft Himalaya" w:eastAsia="Times New Roman" w:hAnsi="Microsoft Himalaya" w:cs="Microsoft Himalaya"/>
-          <w:sz w:val="32"/>
-          <w:szCs w:val="32"/>
-        </w:rPr>
-        <w:t>།</w:t>
-      </w:r>
-      <w:proofErr w:type="spellEnd"/>
+      <w:r>
+        <w:rPr>
+          <w:rFonts w:ascii="Microsoft Himalaya" w:eastAsia="Times New Roman" w:hAnsi="Microsoft Himalaya" w:cs="Microsoft Himalaya"/>
+          <w:sz w:val="32"/>
+          <w:szCs w:val="32"/>
+        </w:rPr>
+        <w:t>།</w:t>
+      </w:r>
     </w:p>
     <w:p>
       <w:pPr>
@@ -5281,62 +5231,50 @@
         </w:rPr>
         <w:t xml:space="preserve"> </w:t>
       </w:r>
-      <w:proofErr w:type="spellStart"/>
-      <w:r>
-        <w:rPr>
-          <w:rFonts w:ascii="Microsoft Himalaya" w:eastAsia="Times New Roman" w:hAnsi="Microsoft Himalaya" w:cs="Microsoft Himalaya"/>
-          <w:sz w:val="32"/>
-          <w:szCs w:val="32"/>
-        </w:rPr>
-        <w:t>།</w:t>
-      </w:r>
-      <w:proofErr w:type="spellEnd"/>
-    </w:p>
-    <w:p>
-      <w:pPr>
-        <w:spacing w:after="0" w:line="240" w:lineRule="auto"/>
-        <w:rPr>
-          <w:rFonts w:ascii="Times New Roman" w:eastAsia="Times New Roman" w:hAnsi="Times New Roman" w:cs="Times New Roman"/>
-          <w:sz w:val="24"/>
-          <w:szCs w:val="24"/>
-        </w:rPr>
-      </w:pPr>
-    </w:p>
-    <w:p>
-      <w:pPr>
-        <w:spacing w:after="0" w:line="240" w:lineRule="auto"/>
-        <w:rPr>
-          <w:rFonts w:ascii="Times New Roman" w:eastAsia="Times New Roman" w:hAnsi="Times New Roman" w:cs="Times New Roman"/>
-          <w:sz w:val="24"/>
-          <w:szCs w:val="24"/>
-        </w:rPr>
-      </w:pPr>
-      <w:proofErr w:type="gramStart"/>
-      <w:r>
-        <w:rPr>
-          <w:rFonts w:ascii="Arial" w:eastAsia="Times New Roman" w:hAnsi="Arial" w:cs="Arial"/>
-          <w:sz w:val="32"/>
-          <w:szCs w:val="32"/>
-        </w:rPr>
-        <w:t>, ​</w:t>
-      </w:r>
-      <w:proofErr w:type="spellStart"/>
-      <w:r>
-        <w:rPr>
-          <w:rFonts w:ascii="Microsoft Himalaya" w:eastAsia="Times New Roman" w:hAnsi="Microsoft Himalaya" w:cs="Microsoft Himalaya"/>
-          <w:sz w:val="32"/>
-          <w:szCs w:val="32"/>
-        </w:rPr>
-        <w:t>ཟབ</w:t>
-      </w:r>
-      <w:proofErr w:type="gramEnd"/>
-      <w:r>
-        <w:rPr>
-          <w:rFonts w:ascii="Microsoft Himalaya" w:eastAsia="Times New Roman" w:hAnsi="Microsoft Himalaya" w:cs="Microsoft Himalaya"/>
-          <w:sz w:val="32"/>
-          <w:szCs w:val="32"/>
-        </w:rPr>
-        <w:t>་མོ་ཁྱད་པར་བརྒྱད་དང་ལྡན་པ་བསྟན་པ་ནི</w:t>
+      <w:r>
+        <w:rPr>
+          <w:rFonts w:ascii="Microsoft Himalaya" w:eastAsia="Times New Roman" w:hAnsi="Microsoft Himalaya" w:cs="Microsoft Himalaya"/>
+          <w:sz w:val="32"/>
+          <w:szCs w:val="32"/>
+        </w:rPr>
+        <w:t>།</w:t>
+      </w:r>
+    </w:p>
+    <w:p>
+      <w:pPr>
+        <w:spacing w:after="0" w:line="240" w:lineRule="auto"/>
+        <w:rPr>
+          <w:rFonts w:ascii="Times New Roman" w:eastAsia="Times New Roman" w:hAnsi="Times New Roman" w:cs="Times New Roman"/>
+          <w:sz w:val="24"/>
+          <w:szCs w:val="24"/>
+        </w:rPr>
+      </w:pPr>
+    </w:p>
+    <w:p>
+      <w:pPr>
+        <w:spacing w:after="0" w:line="240" w:lineRule="auto"/>
+        <w:rPr>
+          <w:rFonts w:ascii="Times New Roman" w:eastAsia="Times New Roman" w:hAnsi="Times New Roman" w:cs="Times New Roman"/>
+          <w:sz w:val="24"/>
+          <w:szCs w:val="24"/>
+        </w:rPr>
+      </w:pPr>
+      <w:r>
+        <w:rPr>
+          <w:rFonts w:ascii="Arial" w:eastAsia="Times New Roman" w:hAnsi="Arial" w:cs="Arial"/>
+          <w:sz w:val="32"/>
+          <w:szCs w:val="32"/>
+        </w:rPr>
+        <w:t xml:space="preserve"> ​</w:t>
+      </w:r>
+      <w:proofErr w:type="spellStart"/>
+      <w:r>
+        <w:rPr>
+          <w:rFonts w:ascii="Microsoft Himalaya" w:eastAsia="Times New Roman" w:hAnsi="Microsoft Himalaya" w:cs="Microsoft Himalaya"/>
+          <w:sz w:val="32"/>
+          <w:szCs w:val="32"/>
+        </w:rPr>
+        <w:t>ཟབ་མོ་ཁྱད་པར་བརྒྱད་དང་ལྡན་པ་བསྟན་པ་ནི</w:t>
       </w:r>
       <w:proofErr w:type="spellEnd"/>
       <w:r>
@@ -5469,16 +5407,14 @@
         </w:rPr>
         <w:t xml:space="preserve"> </w:t>
       </w:r>
-      <w:proofErr w:type="spellStart"/>
-      <w:r>
-        <w:rPr>
-          <w:rFonts w:ascii="Microsoft Himalaya" w:eastAsia="Times New Roman" w:hAnsi="Microsoft Himalaya" w:cs="Microsoft Himalaya"/>
-          <w:sz w:val="32"/>
-          <w:szCs w:val="32"/>
-        </w:rPr>
-        <w:t>།</w:t>
-      </w:r>
-      <w:proofErr w:type="spellEnd"/>
+      <w:r>
+        <w:rPr>
+          <w:rFonts w:ascii="Microsoft Himalaya" w:eastAsia="Times New Roman" w:hAnsi="Microsoft Himalaya" w:cs="Microsoft Himalaya"/>
+          <w:sz w:val="32"/>
+          <w:szCs w:val="32"/>
+        </w:rPr>
+        <w:t>།</w:t>
+      </w:r>
     </w:p>
     <w:p>
       <w:pPr>
@@ -5739,6 +5675,7 @@
           <w:sz w:val="32"/>
           <w:szCs w:val="32"/>
         </w:rPr>
+        <w:lastRenderedPageBreak/>
         <w:t xml:space="preserve"> </w:t>
       </w:r>
       <w:proofErr w:type="spellStart"/>
@@ -5943,61 +5880,49 @@
         </w:rPr>
         <w:t xml:space="preserve"> </w:t>
       </w:r>
-      <w:proofErr w:type="spellStart"/>
-      <w:r>
-        <w:rPr>
-          <w:rFonts w:ascii="Microsoft Himalaya" w:eastAsia="Times New Roman" w:hAnsi="Microsoft Himalaya" w:cs="Microsoft Himalaya"/>
-          <w:sz w:val="32"/>
-          <w:szCs w:val="32"/>
-        </w:rPr>
-        <w:t>།</w:t>
-      </w:r>
-      <w:proofErr w:type="spellEnd"/>
-    </w:p>
-    <w:p>
-      <w:pPr>
-        <w:spacing w:after="0" w:line="240" w:lineRule="auto"/>
-        <w:rPr>
-          <w:rFonts w:ascii="Times New Roman" w:eastAsia="Times New Roman" w:hAnsi="Times New Roman" w:cs="Times New Roman"/>
-          <w:sz w:val="24"/>
-          <w:szCs w:val="24"/>
-        </w:rPr>
-      </w:pPr>
-    </w:p>
-    <w:p>
-      <w:pPr>
-        <w:spacing w:after="0" w:line="240" w:lineRule="auto"/>
-        <w:rPr>
-          <w:rFonts w:ascii="Times New Roman" w:eastAsia="Times New Roman" w:hAnsi="Times New Roman" w:cs="Times New Roman"/>
-          <w:sz w:val="24"/>
-          <w:szCs w:val="24"/>
-        </w:rPr>
-      </w:pPr>
-      <w:proofErr w:type="gramStart"/>
-      <w:r>
-        <w:rPr>
-          <w:rFonts w:ascii="Arial" w:eastAsia="Times New Roman" w:hAnsi="Arial" w:cs="Arial"/>
-          <w:sz w:val="32"/>
-          <w:szCs w:val="32"/>
-        </w:rPr>
-        <w:t>, ​</w:t>
-      </w:r>
-      <w:r>
-        <w:rPr>
-          <w:rFonts w:ascii="Microsoft Himalaya" w:eastAsia="Times New Roman" w:hAnsi="Microsoft Himalaya" w:cs="Microsoft Himalaya"/>
-          <w:sz w:val="32"/>
-          <w:szCs w:val="32"/>
-        </w:rPr>
-        <w:t>ཆ</w:t>
-      </w:r>
-      <w:proofErr w:type="gramEnd"/>
-      <w:r>
-        <w:rPr>
-          <w:rFonts w:ascii="Microsoft Himalaya" w:eastAsia="Times New Roman" w:hAnsi="Microsoft Himalaya" w:cs="Microsoft Himalaya"/>
-          <w:sz w:val="32"/>
-          <w:szCs w:val="32"/>
-        </w:rPr>
-        <w:t>ོས་ཐམས་ཅད་སྟོང་པ་ཉིད་ཡིན་པ་དེ་བས་ན་ཕུང་པོ་ལྔས་སྟོང་པར་བསྟན་པ་ནི།</w:t>
+      <w:r>
+        <w:rPr>
+          <w:rFonts w:ascii="Microsoft Himalaya" w:eastAsia="Times New Roman" w:hAnsi="Microsoft Himalaya" w:cs="Microsoft Himalaya"/>
+          <w:sz w:val="32"/>
+          <w:szCs w:val="32"/>
+        </w:rPr>
+        <w:t>།</w:t>
+      </w:r>
+    </w:p>
+    <w:p>
+      <w:pPr>
+        <w:spacing w:after="0" w:line="240" w:lineRule="auto"/>
+        <w:rPr>
+          <w:rFonts w:ascii="Times New Roman" w:eastAsia="Times New Roman" w:hAnsi="Times New Roman" w:cs="Times New Roman"/>
+          <w:sz w:val="24"/>
+          <w:szCs w:val="24"/>
+        </w:rPr>
+      </w:pPr>
+    </w:p>
+    <w:p>
+      <w:pPr>
+        <w:spacing w:after="0" w:line="240" w:lineRule="auto"/>
+        <w:rPr>
+          <w:rFonts w:ascii="Times New Roman" w:eastAsia="Times New Roman" w:hAnsi="Times New Roman" w:cs="Times New Roman"/>
+          <w:sz w:val="24"/>
+          <w:szCs w:val="24"/>
+        </w:rPr>
+      </w:pPr>
+      <w:r>
+        <w:rPr>
+          <w:rFonts w:ascii="Arial" w:eastAsia="Times New Roman" w:hAnsi="Arial" w:cs="Arial"/>
+          <w:sz w:val="32"/>
+          <w:szCs w:val="32"/>
+        </w:rPr>
+        <w:t xml:space="preserve"> ​</w:t>
+      </w:r>
+      <w:r>
+        <w:rPr>
+          <w:rFonts w:ascii="Microsoft Himalaya" w:eastAsia="Times New Roman" w:hAnsi="Microsoft Himalaya" w:cs="Microsoft Himalaya"/>
+          <w:sz w:val="32"/>
+          <w:szCs w:val="32"/>
+        </w:rPr>
+        <w:t>ཆོས་ཐམས་ཅད་སྟོང་པ་ཉིད་ཡིན་པ་དེ་བས་ན་ཕུང་པོ་ལྔས་སྟོང་པར་བསྟན་པ་ནི།</w:t>
       </w:r>
       <w:r>
         <w:rPr>
@@ -6133,32 +6058,22 @@
           <w:szCs w:val="24"/>
         </w:rPr>
       </w:pPr>
-      <w:proofErr w:type="gramStart"/>
-      <w:r>
-        <w:rPr>
-          <w:rFonts w:ascii="Arial" w:eastAsia="Times New Roman" w:hAnsi="Arial" w:cs="Arial"/>
-          <w:sz w:val="32"/>
-          <w:szCs w:val="32"/>
-        </w:rPr>
-        <w:t>, ​</w:t>
-      </w:r>
-      <w:proofErr w:type="spellStart"/>
-      <w:r>
-        <w:rPr>
-          <w:rFonts w:ascii="Microsoft Himalaya" w:eastAsia="Times New Roman" w:hAnsi="Microsoft Himalaya" w:cs="Microsoft Himalaya"/>
-          <w:sz w:val="32"/>
-          <w:szCs w:val="32"/>
-        </w:rPr>
-        <w:t>སྐྱ</w:t>
-      </w:r>
-      <w:proofErr w:type="gramEnd"/>
-      <w:r>
-        <w:rPr>
-          <w:rFonts w:ascii="Microsoft Himalaya" w:eastAsia="Times New Roman" w:hAnsi="Microsoft Himalaya" w:cs="Microsoft Himalaya"/>
-          <w:sz w:val="32"/>
-          <w:szCs w:val="32"/>
-        </w:rPr>
-        <w:t>ེ་མཆེད་བཅུ་གཉིས་མེད་པར་བསྟན་པ་ནི</w:t>
+      <w:r>
+        <w:rPr>
+          <w:rFonts w:ascii="Arial" w:eastAsia="Times New Roman" w:hAnsi="Arial" w:cs="Arial"/>
+          <w:sz w:val="32"/>
+          <w:szCs w:val="32"/>
+        </w:rPr>
+        <w:t xml:space="preserve"> ​</w:t>
+      </w:r>
+      <w:proofErr w:type="spellStart"/>
+      <w:r>
+        <w:rPr>
+          <w:rFonts w:ascii="Microsoft Himalaya" w:eastAsia="Times New Roman" w:hAnsi="Microsoft Himalaya" w:cs="Microsoft Himalaya"/>
+          <w:sz w:val="32"/>
+          <w:szCs w:val="32"/>
+        </w:rPr>
+        <w:t>སྐྱེ་མཆེད་བཅུ་གཉིས་མེད་པར་བསྟན་པ་ནི</w:t>
       </w:r>
       <w:proofErr w:type="spellEnd"/>
       <w:r>
@@ -6549,32 +6464,22 @@
           <w:szCs w:val="24"/>
         </w:rPr>
       </w:pPr>
-      <w:proofErr w:type="gramStart"/>
-      <w:r>
-        <w:rPr>
-          <w:rFonts w:ascii="Arial" w:eastAsia="Times New Roman" w:hAnsi="Arial" w:cs="Arial"/>
-          <w:sz w:val="32"/>
-          <w:szCs w:val="32"/>
-        </w:rPr>
-        <w:t>, ​</w:t>
-      </w:r>
-      <w:proofErr w:type="spellStart"/>
-      <w:r>
-        <w:rPr>
-          <w:rFonts w:ascii="Microsoft Himalaya" w:eastAsia="Times New Roman" w:hAnsi="Microsoft Himalaya" w:cs="Microsoft Himalaya"/>
-          <w:sz w:val="32"/>
-          <w:szCs w:val="32"/>
-        </w:rPr>
-        <w:t>ཀ</w:t>
-      </w:r>
-      <w:proofErr w:type="gramEnd"/>
-      <w:r>
-        <w:rPr>
-          <w:rFonts w:ascii="Microsoft Himalaya" w:eastAsia="Times New Roman" w:hAnsi="Microsoft Himalaya" w:cs="Microsoft Himalaya"/>
-          <w:sz w:val="32"/>
-          <w:szCs w:val="32"/>
-        </w:rPr>
-        <w:t>ུན་ནས་ཉོན་མོངས་པའི་རྟེན་འབྲེལ་མེད་པར་བསྟན་པ་ནི</w:t>
+      <w:r>
+        <w:rPr>
+          <w:rFonts w:ascii="Arial" w:eastAsia="Times New Roman" w:hAnsi="Arial" w:cs="Arial"/>
+          <w:sz w:val="32"/>
+          <w:szCs w:val="32"/>
+        </w:rPr>
+        <w:t xml:space="preserve"> ​</w:t>
+      </w:r>
+      <w:proofErr w:type="spellStart"/>
+      <w:r>
+        <w:rPr>
+          <w:rFonts w:ascii="Microsoft Himalaya" w:eastAsia="Times New Roman" w:hAnsi="Microsoft Himalaya" w:cs="Microsoft Himalaya"/>
+          <w:sz w:val="32"/>
+          <w:szCs w:val="32"/>
+        </w:rPr>
+        <w:t>ཀུན་ནས་ཉོན་མོངས་པའི་རྟེན་འབྲེལ་མེད་པར་བསྟན་པ་ནི</w:t>
       </w:r>
       <w:proofErr w:type="spellEnd"/>
       <w:r>
@@ -7013,16 +6918,14 @@
         </w:rPr>
         <w:t xml:space="preserve"> </w:t>
       </w:r>
-      <w:proofErr w:type="spellStart"/>
-      <w:r>
-        <w:rPr>
-          <w:rFonts w:ascii="Microsoft Himalaya" w:eastAsia="Times New Roman" w:hAnsi="Microsoft Himalaya" w:cs="Microsoft Himalaya"/>
-          <w:sz w:val="32"/>
-          <w:szCs w:val="32"/>
-        </w:rPr>
-        <w:t>།</w:t>
-      </w:r>
-      <w:proofErr w:type="spellEnd"/>
+      <w:r>
+        <w:rPr>
+          <w:rFonts w:ascii="Microsoft Himalaya" w:eastAsia="Times New Roman" w:hAnsi="Microsoft Himalaya" w:cs="Microsoft Himalaya"/>
+          <w:sz w:val="32"/>
+          <w:szCs w:val="32"/>
+        </w:rPr>
+        <w:t>།</w:t>
+      </w:r>
     </w:p>
     <w:p>
       <w:pPr>
@@ -7743,7 +7646,7 @@
           <w:sz w:val="32"/>
           <w:szCs w:val="32"/>
         </w:rPr>
-        <w:t xml:space="preserve">, </w:t>
+        <w:t xml:space="preserve"> </w:t>
       </w:r>
       <w:r>
         <w:rPr>
@@ -8143,16 +8046,14 @@
         </w:rPr>
         <w:t xml:space="preserve"> </w:t>
       </w:r>
-      <w:proofErr w:type="spellStart"/>
-      <w:r>
-        <w:rPr>
-          <w:rFonts w:ascii="Microsoft Himalaya" w:eastAsia="Times New Roman" w:hAnsi="Microsoft Himalaya" w:cs="Microsoft Himalaya"/>
-          <w:sz w:val="32"/>
-          <w:szCs w:val="32"/>
-        </w:rPr>
-        <w:t>།</w:t>
-      </w:r>
-      <w:proofErr w:type="spellEnd"/>
+      <w:r>
+        <w:rPr>
+          <w:rFonts w:ascii="Microsoft Himalaya" w:eastAsia="Times New Roman" w:hAnsi="Microsoft Himalaya" w:cs="Microsoft Himalaya"/>
+          <w:sz w:val="32"/>
+          <w:szCs w:val="32"/>
+        </w:rPr>
+        <w:t>།</w:t>
+      </w:r>
     </w:p>
     <w:p>
       <w:pPr>
@@ -8225,16 +8126,14 @@
         </w:rPr>
         <w:t xml:space="preserve"> </w:t>
       </w:r>
-      <w:proofErr w:type="spellStart"/>
-      <w:r>
-        <w:rPr>
-          <w:rFonts w:ascii="Microsoft Himalaya" w:eastAsia="Times New Roman" w:hAnsi="Microsoft Himalaya" w:cs="Microsoft Himalaya"/>
-          <w:sz w:val="32"/>
-          <w:szCs w:val="32"/>
-        </w:rPr>
-        <w:t>།</w:t>
-      </w:r>
-      <w:proofErr w:type="spellEnd"/>
+      <w:r>
+        <w:rPr>
+          <w:rFonts w:ascii="Microsoft Himalaya" w:eastAsia="Times New Roman" w:hAnsi="Microsoft Himalaya" w:cs="Microsoft Himalaya"/>
+          <w:sz w:val="32"/>
+          <w:szCs w:val="32"/>
+        </w:rPr>
+        <w:t>།</w:t>
+      </w:r>
     </w:p>
     <w:p>
       <w:pPr>
@@ -9207,129 +9106,129 @@
           <w:sz w:val="32"/>
           <w:szCs w:val="32"/>
         </w:rPr>
+        <w:t xml:space="preserve"> ​</w:t>
+      </w:r>
+      <w:proofErr w:type="spellStart"/>
+      <w:r>
+        <w:rPr>
+          <w:rFonts w:ascii="Microsoft Himalaya" w:eastAsia="Times New Roman" w:hAnsi="Microsoft Himalaya" w:cs="Microsoft Himalaya"/>
+          <w:sz w:val="32"/>
+          <w:szCs w:val="32"/>
+        </w:rPr>
+        <w:t>ཞལ་ནས་ནས་གསུངས་པའི་བཀའ་བསྟན་པ་ནི</w:t>
+      </w:r>
+      <w:proofErr w:type="spellEnd"/>
+      <w:r>
+        <w:rPr>
+          <w:rFonts w:ascii="Microsoft Himalaya" w:eastAsia="Times New Roman" w:hAnsi="Microsoft Himalaya" w:cs="Microsoft Himalaya"/>
+          <w:sz w:val="32"/>
+          <w:szCs w:val="32"/>
+        </w:rPr>
+        <w:t>།</w:t>
+      </w:r>
+      <w:r>
+        <w:rPr>
+          <w:rFonts w:ascii="Arial" w:eastAsia="Times New Roman" w:hAnsi="Arial" w:cs="Arial"/>
+          <w:sz w:val="32"/>
+          <w:szCs w:val="32"/>
+        </w:rPr>
+        <w:t xml:space="preserve"> </w:t>
+      </w:r>
+      <w:proofErr w:type="spellStart"/>
+      <w:r>
+        <w:rPr>
+          <w:rFonts w:ascii="Microsoft Himalaya" w:eastAsia="Times New Roman" w:hAnsi="Microsoft Himalaya" w:cs="Microsoft Himalaya"/>
+          <w:sz w:val="32"/>
+          <w:szCs w:val="32"/>
+        </w:rPr>
+        <w:t>དེ་སྐད་ཅེས་སྨྲས་པ་དང</w:t>
+      </w:r>
+      <w:proofErr w:type="spellEnd"/>
+      <w:r>
+        <w:rPr>
+          <w:rFonts w:ascii="Microsoft Himalaya" w:eastAsia="Times New Roman" w:hAnsi="Microsoft Himalaya" w:cs="Microsoft Himalaya"/>
+          <w:sz w:val="32"/>
+          <w:szCs w:val="32"/>
+        </w:rPr>
+        <w:t>་།</w:t>
+      </w:r>
+      <w:r>
+        <w:rPr>
+          <w:rFonts w:ascii="Arial" w:eastAsia="Times New Roman" w:hAnsi="Arial" w:cs="Arial"/>
+          <w:sz w:val="32"/>
+          <w:szCs w:val="32"/>
+        </w:rPr>
+        <w:t xml:space="preserve"> </w:t>
+      </w:r>
+      <w:proofErr w:type="spellStart"/>
+      <w:r>
+        <w:rPr>
+          <w:rFonts w:ascii="Microsoft Himalaya" w:eastAsia="Times New Roman" w:hAnsi="Microsoft Himalaya" w:cs="Microsoft Himalaya"/>
+          <w:b/>
+          <w:bCs/>
+          <w:sz w:val="32"/>
+          <w:szCs w:val="32"/>
+        </w:rPr>
+        <w:t>བཅོམ་ལྡན་འདས་</w:t>
+      </w:r>
+      <w:r>
+        <w:rPr>
+          <w:rFonts w:ascii="Microsoft Himalaya" w:eastAsia="Times New Roman" w:hAnsi="Microsoft Himalaya" w:cs="Microsoft Himalaya"/>
+          <w:sz w:val="32"/>
+          <w:szCs w:val="32"/>
+        </w:rPr>
+        <w:t>སྔར་ཟབ་མོ་སྣང་བ་ཞེས་བའི་</w:t>
+      </w:r>
+      <w:r>
+        <w:rPr>
+          <w:rFonts w:ascii="Microsoft Himalaya" w:eastAsia="Times New Roman" w:hAnsi="Microsoft Himalaya" w:cs="Microsoft Himalaya"/>
+          <w:b/>
+          <w:bCs/>
+          <w:sz w:val="32"/>
+          <w:szCs w:val="32"/>
+        </w:rPr>
+        <w:t>ཏིང་འཛིན་དེ་ལས་བཞེངས་ཏེ</w:t>
+      </w:r>
+      <w:proofErr w:type="spellEnd"/>
+      <w:r>
+        <w:rPr>
+          <w:rFonts w:ascii="Microsoft Himalaya" w:eastAsia="Times New Roman" w:hAnsi="Microsoft Himalaya" w:cs="Microsoft Himalaya"/>
+          <w:b/>
+          <w:bCs/>
+          <w:sz w:val="32"/>
+          <w:szCs w:val="32"/>
+        </w:rPr>
+        <w:t>་</w:t>
+      </w:r>
+    </w:p>
+    <w:p>
+      <w:pPr>
+        <w:spacing w:after="0" w:line="240" w:lineRule="auto"/>
+        <w:rPr>
+          <w:rFonts w:ascii="Times New Roman" w:eastAsia="Times New Roman" w:hAnsi="Times New Roman" w:cs="Times New Roman"/>
+          <w:sz w:val="24"/>
+          <w:szCs w:val="24"/>
+        </w:rPr>
+      </w:pPr>
+    </w:p>
+    <w:p>
+      <w:pPr>
+        <w:spacing w:after="0" w:line="240" w:lineRule="auto"/>
+        <w:rPr>
+          <w:rFonts w:ascii="Times New Roman" w:eastAsia="Times New Roman" w:hAnsi="Times New Roman" w:cs="Times New Roman"/>
+          <w:sz w:val="24"/>
+          <w:szCs w:val="24"/>
+        </w:rPr>
+      </w:pPr>
+      <w:r>
+        <w:rPr>
+          <w:rFonts w:ascii="Arial" w:eastAsia="Times New Roman" w:hAnsi="Arial" w:cs="Arial"/>
+          <w:b/>
+          <w:bCs/>
+          <w:sz w:val="32"/>
+          <w:szCs w:val="32"/>
+        </w:rPr>
         <w:lastRenderedPageBreak/>
-        <w:t xml:space="preserve"> ​</w:t>
-      </w:r>
-      <w:proofErr w:type="spellStart"/>
-      <w:r>
-        <w:rPr>
-          <w:rFonts w:ascii="Microsoft Himalaya" w:eastAsia="Times New Roman" w:hAnsi="Microsoft Himalaya" w:cs="Microsoft Himalaya"/>
-          <w:sz w:val="32"/>
-          <w:szCs w:val="32"/>
-        </w:rPr>
-        <w:t>ཞལ་ནས་ནས་གསུངས་པའི་བཀའ་བསྟན་པ་ནི</w:t>
-      </w:r>
-      <w:proofErr w:type="spellEnd"/>
-      <w:r>
-        <w:rPr>
-          <w:rFonts w:ascii="Microsoft Himalaya" w:eastAsia="Times New Roman" w:hAnsi="Microsoft Himalaya" w:cs="Microsoft Himalaya"/>
-          <w:sz w:val="32"/>
-          <w:szCs w:val="32"/>
-        </w:rPr>
-        <w:t>།</w:t>
-      </w:r>
-      <w:r>
-        <w:rPr>
-          <w:rFonts w:ascii="Arial" w:eastAsia="Times New Roman" w:hAnsi="Arial" w:cs="Arial"/>
-          <w:sz w:val="32"/>
-          <w:szCs w:val="32"/>
-        </w:rPr>
-        <w:t xml:space="preserve"> </w:t>
-      </w:r>
-      <w:proofErr w:type="spellStart"/>
-      <w:r>
-        <w:rPr>
-          <w:rFonts w:ascii="Microsoft Himalaya" w:eastAsia="Times New Roman" w:hAnsi="Microsoft Himalaya" w:cs="Microsoft Himalaya"/>
-          <w:sz w:val="32"/>
-          <w:szCs w:val="32"/>
-        </w:rPr>
-        <w:t>དེ་སྐད་ཅེས་སྨྲས་པ་དང</w:t>
-      </w:r>
-      <w:proofErr w:type="spellEnd"/>
-      <w:r>
-        <w:rPr>
-          <w:rFonts w:ascii="Microsoft Himalaya" w:eastAsia="Times New Roman" w:hAnsi="Microsoft Himalaya" w:cs="Microsoft Himalaya"/>
-          <w:sz w:val="32"/>
-          <w:szCs w:val="32"/>
-        </w:rPr>
-        <w:t>་།</w:t>
-      </w:r>
-      <w:r>
-        <w:rPr>
-          <w:rFonts w:ascii="Arial" w:eastAsia="Times New Roman" w:hAnsi="Arial" w:cs="Arial"/>
-          <w:sz w:val="32"/>
-          <w:szCs w:val="32"/>
-        </w:rPr>
-        <w:t xml:space="preserve"> </w:t>
-      </w:r>
-      <w:proofErr w:type="spellStart"/>
-      <w:r>
-        <w:rPr>
-          <w:rFonts w:ascii="Microsoft Himalaya" w:eastAsia="Times New Roman" w:hAnsi="Microsoft Himalaya" w:cs="Microsoft Himalaya"/>
-          <w:b/>
-          <w:bCs/>
-          <w:sz w:val="32"/>
-          <w:szCs w:val="32"/>
-        </w:rPr>
-        <w:t>བཅོམ་ལྡན་འདས་</w:t>
-      </w:r>
-      <w:r>
-        <w:rPr>
-          <w:rFonts w:ascii="Microsoft Himalaya" w:eastAsia="Times New Roman" w:hAnsi="Microsoft Himalaya" w:cs="Microsoft Himalaya"/>
-          <w:sz w:val="32"/>
-          <w:szCs w:val="32"/>
-        </w:rPr>
-        <w:t>སྔར་ཟབ་མོ་སྣང་བ་ཞེས་བའི་</w:t>
-      </w:r>
-      <w:r>
-        <w:rPr>
-          <w:rFonts w:ascii="Microsoft Himalaya" w:eastAsia="Times New Roman" w:hAnsi="Microsoft Himalaya" w:cs="Microsoft Himalaya"/>
-          <w:b/>
-          <w:bCs/>
-          <w:sz w:val="32"/>
-          <w:szCs w:val="32"/>
-        </w:rPr>
-        <w:t>ཏིང་འཛིན་དེ་ལས་བཞེངས་ཏེ</w:t>
-      </w:r>
-      <w:proofErr w:type="spellEnd"/>
-      <w:r>
-        <w:rPr>
-          <w:rFonts w:ascii="Microsoft Himalaya" w:eastAsia="Times New Roman" w:hAnsi="Microsoft Himalaya" w:cs="Microsoft Himalaya"/>
-          <w:b/>
-          <w:bCs/>
-          <w:sz w:val="32"/>
-          <w:szCs w:val="32"/>
-        </w:rPr>
-        <w:t>་</w:t>
-      </w:r>
-    </w:p>
-    <w:p>
-      <w:pPr>
-        <w:spacing w:after="0" w:line="240" w:lineRule="auto"/>
-        <w:rPr>
-          <w:rFonts w:ascii="Times New Roman" w:eastAsia="Times New Roman" w:hAnsi="Times New Roman" w:cs="Times New Roman"/>
-          <w:sz w:val="24"/>
-          <w:szCs w:val="24"/>
-        </w:rPr>
-      </w:pPr>
-    </w:p>
-    <w:p>
-      <w:pPr>
-        <w:spacing w:after="0" w:line="240" w:lineRule="auto"/>
-        <w:rPr>
-          <w:rFonts w:ascii="Times New Roman" w:eastAsia="Times New Roman" w:hAnsi="Times New Roman" w:cs="Times New Roman"/>
-          <w:sz w:val="24"/>
-          <w:szCs w:val="24"/>
-        </w:rPr>
-      </w:pPr>
-      <w:r>
-        <w:rPr>
-          <w:rFonts w:ascii="Arial" w:eastAsia="Times New Roman" w:hAnsi="Arial" w:cs="Arial"/>
-          <w:b/>
-          <w:bCs/>
-          <w:sz w:val="32"/>
-          <w:szCs w:val="32"/>
-        </w:rPr>
         <w:t xml:space="preserve"> </w:t>
       </w:r>
       <w:r>
@@ -9470,18 +9369,16 @@
         </w:rPr>
         <w:t xml:space="preserve"> </w:t>
       </w:r>
-      <w:proofErr w:type="spellStart"/>
-      <w:r>
-        <w:rPr>
-          <w:rFonts w:ascii="Microsoft Himalaya" w:eastAsia="Times New Roman" w:hAnsi="Microsoft Himalaya" w:cs="Microsoft Himalaya"/>
-          <w:b/>
-          <w:bCs/>
-          <w:sz w:val="32"/>
-          <w:szCs w:val="32"/>
-        </w:rPr>
-        <w:t>།</w:t>
-      </w:r>
-      <w:proofErr w:type="spellEnd"/>
+      <w:r>
+        <w:rPr>
+          <w:rFonts w:ascii="Microsoft Himalaya" w:eastAsia="Times New Roman" w:hAnsi="Microsoft Himalaya" w:cs="Microsoft Himalaya"/>
+          <w:b/>
+          <w:bCs/>
+          <w:sz w:val="32"/>
+          <w:szCs w:val="32"/>
+        </w:rPr>
+        <w:t>།</w:t>
+      </w:r>
     </w:p>
     <w:p>
       <w:pPr>
@@ -10242,7 +10139,6 @@
         </w:rPr>
         <w:t xml:space="preserve"> </w:t>
       </w:r>
-      <w:proofErr w:type="spellStart"/>
       <w:r>
         <w:rPr>
           <w:rFonts w:ascii="Microsoft Himalaya" w:eastAsia="Times New Roman" w:hAnsi="Microsoft Himalaya" w:cs="Microsoft Himalaya"/>
@@ -10255,7 +10151,6 @@
         </w:rPr>
         <w:t>།</w:t>
       </w:r>
-      <w:proofErr w:type="spellEnd"/>
     </w:p>
     <w:p>
       <w:pPr>
@@ -10316,7 +10211,6 @@
         </w:rPr>
         <w:t xml:space="preserve"> </w:t>
       </w:r>
-      <w:proofErr w:type="spellStart"/>
       <w:r>
         <w:rPr>
           <w:rFonts w:ascii="Microsoft Himalaya" w:eastAsia="Times New Roman" w:hAnsi="Microsoft Himalaya" w:cs="Microsoft Himalaya"/>
@@ -10329,7 +10223,6 @@
         </w:rPr>
         <w:t>།</w:t>
       </w:r>
-      <w:proofErr w:type="spellEnd"/>
     </w:p>
     <w:p>
       <w:pPr>
@@ -10390,7 +10283,6 @@
         </w:rPr>
         <w:t xml:space="preserve"> </w:t>
       </w:r>
-      <w:proofErr w:type="spellStart"/>
       <w:r>
         <w:rPr>
           <w:rFonts w:ascii="Microsoft Himalaya" w:eastAsia="Times New Roman" w:hAnsi="Microsoft Himalaya" w:cs="Microsoft Himalaya"/>
@@ -10403,7 +10295,6 @@
         </w:rPr>
         <w:t>།</w:t>
       </w:r>
-      <w:proofErr w:type="spellEnd"/>
     </w:p>
     <w:p>
       <w:pPr>
@@ -10666,7 +10557,6 @@
         </w:rPr>
         <w:t xml:space="preserve"> </w:t>
       </w:r>
-      <w:proofErr w:type="spellStart"/>
       <w:r>
         <w:rPr>
           <w:rFonts w:ascii="Microsoft Himalaya" w:eastAsia="Times New Roman" w:hAnsi="Microsoft Himalaya" w:cs="Microsoft Himalaya"/>
@@ -10679,7 +10569,6 @@
         </w:rPr>
         <w:t>།</w:t>
       </w:r>
-      <w:proofErr w:type="spellEnd"/>
     </w:p>
     <w:p>
       <w:pPr>
@@ -10993,6 +10882,7 @@
   <w:style w:type="paragraph" w:default="1" w:styleId="Normal">
     <w:name w:val="Normal"/>
     <w:qFormat/>
+    <w:rsid w:val="00401896"/>
   </w:style>
   <w:style w:type="character" w:default="1" w:styleId="DefaultParagraphFont">
     <w:name w:val="Default Paragraph Font"/>

</xml_diff>